<commit_message>
Add Supplementary Data 1 & 2, Supplementary Table 1 (15k priors), Supplementary Display 1, and update Supplementary Information Complete
</commit_message>
<xml_diff>
--- a/supplementary/Supplementary_Information_Complete.docx
+++ b/supplementary/Supplementary_Information_Complete.docx
@@ -186,6 +186,23 @@
           <w:sz w:val="21"/>
         </w:rPr>
         <w:t>• Supplementary Note 6: Biochemical Mechanism of Synergistic Epigenetic Combination Therapies</w:t>
+      </w:r>
+    </w:p>
+    <w:p>
+      <w:pPr>
+        <w:spacing w:before="40" w:after="40" w:line="276" w:lineRule="auto"/>
+        <w:ind w:left="360"/>
+        <w:jc w:val="both"/>
+      </w:pPr>
+      <w:r>
+        <w:rPr>
+          <w:rFonts w:ascii="Times New Roman" w:hAnsi="Times New Roman"/>
+          <w:b w:val="0"/>
+          <w:i w:val="0"/>
+          <w:color w:val="000000"/>
+          <w:sz w:val="21"/>
+        </w:rPr>
+        <w:t>• Guide to Supplementary Data, Tables, and Interactive Displays</w:t>
       </w:r>
     </w:p>
     <w:p>
@@ -497,6 +514,208 @@
       </w:r>
     </w:p>
     <w:p>
+      <w:r>
+        <w:br w:type="page"/>
+      </w:r>
+    </w:p>
+    <w:p>
+      <w:pPr>
+        <w:spacing w:before="160" w:after="120" w:line="276" w:lineRule="auto"/>
+        <w:jc w:val="both"/>
+      </w:pPr>
+      <w:r>
+        <w:rPr>
+          <w:rFonts w:ascii="Times New Roman" w:hAnsi="Times New Roman"/>
+          <w:b/>
+          <w:i w:val="0"/>
+          <w:color w:val="000000"/>
+          <w:sz w:val="28"/>
+        </w:rPr>
+        <w:t>Guide to Supplementary Data, Tables, and Interactive Displays</w:t>
+      </w:r>
+    </w:p>
+    <w:p>
+      <w:pPr>
+        <w:spacing w:before="40" w:after="120" w:line="276" w:lineRule="auto"/>
+        <w:jc w:val="both"/>
+      </w:pPr>
+      <w:r>
+        <w:rPr>
+          <w:rFonts w:ascii="Times New Roman" w:hAnsi="Times New Roman"/>
+          <w:b w:val="0"/>
+          <w:i w:val="0"/>
+          <w:color w:val="000000"/>
+          <w:sz w:val="22"/>
+        </w:rPr>
+        <w:t>In accordance with journal data reporting standards (Nature Portfolio, Bioinformatics, Genome Biology), the manuscript links to external high-throughput datasets, comprehensive prior matrices, and standalone interactive visualization models. These artifacts are organized as follows:</w:t>
+      </w:r>
+    </w:p>
+    <w:p>
+      <w:pPr>
+        <w:spacing w:before="80" w:after="40" w:line="276" w:lineRule="auto"/>
+        <w:jc w:val="both"/>
+      </w:pPr>
+      <w:r>
+        <w:rPr>
+          <w:rFonts w:ascii="Times New Roman" w:hAnsi="Times New Roman"/>
+          <w:b/>
+          <w:i w:val="0"/>
+          <w:color w:val="000000"/>
+          <w:sz w:val="22"/>
+        </w:rPr>
+        <w:t>Supplementary Data 1 (Supplementary_Data_1_Dataset_and_QC_Summary.xlsx)</w:t>
+      </w:r>
+    </w:p>
+    <w:p>
+      <w:pPr>
+        <w:spacing w:before="0" w:after="80" w:line="276" w:lineRule="auto"/>
+        <w:ind w:left="288"/>
+        <w:jc w:val="both"/>
+      </w:pPr>
+      <w:r>
+        <w:rPr>
+          <w:rFonts w:ascii="Times New Roman" w:hAnsi="Times New Roman"/>
+          <w:b w:val="0"/>
+          <w:i w:val="0"/>
+          <w:color w:val="000000"/>
+          <w:sz w:val="21"/>
+        </w:rPr>
+        <w:t>Comprehensive catalog of experimental single-cell sequencing parameters, cell filtering thresholds (&gt;= 200 detected genes, &lt;= 15% mitochondrial reads), sequencing depth metrics (median 6,519 UMIs, 2,138 genes), and cohort breakdowns across 95,678 MDA-MB-231 cells (GSE224986).</w:t>
+      </w:r>
+    </w:p>
+    <w:p>
+      <w:pPr>
+        <w:spacing w:before="80" w:after="40" w:line="276" w:lineRule="auto"/>
+        <w:jc w:val="both"/>
+      </w:pPr>
+      <w:r>
+        <w:rPr>
+          <w:rFonts w:ascii="Times New Roman" w:hAnsi="Times New Roman"/>
+          <w:b/>
+          <w:i w:val="0"/>
+          <w:color w:val="000000"/>
+          <w:sz w:val="22"/>
+        </w:rPr>
+        <w:t>Supplementary Table 1 (Supplementary_Table_1_Full_15k_TF_Enhancer_Priors.xlsx)</w:t>
+      </w:r>
+    </w:p>
+    <w:p>
+      <w:pPr>
+        <w:spacing w:before="0" w:after="80" w:line="276" w:lineRule="auto"/>
+        <w:ind w:left="288"/>
+        <w:jc w:val="both"/>
+      </w:pPr>
+      <w:r>
+        <w:rPr>
+          <w:rFonts w:ascii="Times New Roman" w:hAnsi="Times New Roman"/>
+          <w:b w:val="0"/>
+          <w:i w:val="0"/>
+          <w:color w:val="000000"/>
+          <w:sz w:val="21"/>
+        </w:rPr>
+        <w:t>Full genome-wide physical transcription factor binding prior matrix, encompassing all 15,059 physical TF–enhancer binding events across 161 unique transcription factors mapped to 819 targeted super-enhancer loci from ENCODE Factorbook ChIP-seq data (encRegTfbsClustered).</w:t>
+      </w:r>
+    </w:p>
+    <w:p>
+      <w:pPr>
+        <w:spacing w:before="80" w:after="40" w:line="276" w:lineRule="auto"/>
+        <w:jc w:val="both"/>
+      </w:pPr>
+      <w:r>
+        <w:rPr>
+          <w:rFonts w:ascii="Times New Roman" w:hAnsi="Times New Roman"/>
+          <w:b/>
+          <w:i w:val="0"/>
+          <w:color w:val="000000"/>
+          <w:sz w:val="22"/>
+        </w:rPr>
+        <w:t>Supplementary Data 2 (Supplementary_Data_2_Perturbation_Responses.csv.gz)</w:t>
+      </w:r>
+    </w:p>
+    <w:p>
+      <w:pPr>
+        <w:spacing w:before="0" w:after="80" w:line="276" w:lineRule="auto"/>
+        <w:ind w:left="288"/>
+        <w:jc w:val="both"/>
+      </w:pPr>
+      <w:r>
+        <w:rPr>
+          <w:rFonts w:ascii="Times New Roman" w:hAnsi="Times New Roman"/>
+          <w:b w:val="0"/>
+          <w:i w:val="0"/>
+          <w:color w:val="000000"/>
+          <w:sz w:val="21"/>
+        </w:rPr>
+        <w:t>Interventional functional perturbation response matrix containing 1,110,566 candidate functional regulatory responses (|log2 FC| &gt;= 0.25, |t| &gt;= 2.5, p &lt; 0.012) across 819 targeted super-enhancers and 32,799 target genes in MDA-MB-231 cells. Preserved as a compressed GZIP CSV (25.1 MB) in repository data archives.</w:t>
+      </w:r>
+    </w:p>
+    <w:p>
+      <w:pPr>
+        <w:spacing w:before="80" w:after="40" w:line="276" w:lineRule="auto"/>
+        <w:jc w:val="both"/>
+      </w:pPr>
+      <w:r>
+        <w:rPr>
+          <w:rFonts w:ascii="Times New Roman" w:hAnsi="Times New Roman"/>
+          <w:b/>
+          <w:i w:val="0"/>
+          <w:color w:val="000000"/>
+          <w:sz w:val="22"/>
+        </w:rPr>
+        <w:t>Supplementary Data 3 (Supplementary_Data_3_Tripartite_Causal_GRN.csv.gz)</w:t>
+      </w:r>
+    </w:p>
+    <w:p>
+      <w:pPr>
+        <w:spacing w:before="0" w:after="80" w:line="276" w:lineRule="auto"/>
+        <w:ind w:left="288"/>
+        <w:jc w:val="both"/>
+      </w:pPr>
+      <w:r>
+        <w:rPr>
+          <w:rFonts w:ascii="Times New Roman" w:hAnsi="Times New Roman"/>
+          <w:b w:val="0"/>
+          <w:i w:val="0"/>
+          <w:color w:val="000000"/>
+          <w:sz w:val="21"/>
+        </w:rPr>
+        <w:t>Complete triangulated tripartite causal Gene Regulatory Network matrix, encompassing 6,366,350 high-confidence directed regulatory paths (TF -&gt; Enhancer -&gt; Target Gene) with composite causal regulatory weights. Deposited with open-science permanent DOI (180.2 MB compressed GZIP CSV).</w:t>
+      </w:r>
+    </w:p>
+    <w:p>
+      <w:pPr>
+        <w:spacing w:before="80" w:after="40" w:line="276" w:lineRule="auto"/>
+        <w:jc w:val="both"/>
+      </w:pPr>
+      <w:r>
+        <w:rPr>
+          <w:rFonts w:ascii="Times New Roman" w:hAnsi="Times New Roman"/>
+          <w:b/>
+          <w:i w:val="0"/>
+          <w:color w:val="000000"/>
+          <w:sz w:val="22"/>
+        </w:rPr>
+        <w:t>Supplementary Display 1 (Supplementary_Display_1_Interactive_Network.html)</w:t>
+      </w:r>
+    </w:p>
+    <w:p>
+      <w:pPr>
+        <w:spacing w:before="0" w:after="80" w:line="276" w:lineRule="auto"/>
+        <w:ind w:left="288"/>
+        <w:jc w:val="both"/>
+      </w:pPr>
+      <w:r>
+        <w:rPr>
+          <w:rFonts w:ascii="Times New Roman" w:hAnsi="Times New Roman"/>
+          <w:b w:val="0"/>
+          <w:i w:val="0"/>
+          <w:color w:val="000000"/>
+          <w:sz w:val="21"/>
+        </w:rPr>
+        <w:t>Standalone, interactive 2D/3D force-directed physics graph of the reconstructed tripartite causal regulatory network, enabling dynamic zooming, draggable nodes, regulon filtering, and sub-network inspection directly in standard web browsers.</w:t>
+      </w:r>
+    </w:p>
+    <w:p>
       <w:pPr>
         <w:sectPr>
           <w:pgSz w:w="12240" w:h="15840"/>
@@ -1386,7 +1605,7 @@
           <w:color w:val="000000"/>
           <w:sz w:val="18"/>
         </w:rPr>
-        <w:t>Note: Single-cell libraries were generated using 10x Genomics Chromium 3' chemistry with direct guide capture across 8 lanes (Lewis et al., 2024).</w:t>
+        <w:t>Note: Single-cell libraries were generated using 10x Genomics Chromium 3' chemistry with direct guide capture across 8 lanes (Lewis et al., 2024). Full parameters also formatted in Supplementary Data 1.</w:t>
       </w:r>
     </w:p>
     <w:p>
@@ -3316,7 +3535,7 @@
           <w:color w:val="000000"/>
           <w:sz w:val="18"/>
         </w:rPr>
-        <w:t>Note: Top 12 transcription factors ranked by target enhancer occupancy shown. Complete 20-TF cohort provided in repository table.</w:t>
+        <w:t>Note: Top 12 transcription factors ranked by target enhancer occupancy shown. Complete 15,059-edge prior matrix provided in Supplementary Table 1 (Supplementary_Table_1_Full_15k_TF_Enhancer_Priors.xlsx).</w:t>
       </w:r>
     </w:p>
     <w:p>
@@ -5611,7 +5830,7 @@
           <w:color w:val="000000"/>
           <w:sz w:val="18"/>
         </w:rPr>
-        <w:t>Note: Top 12 causal regulators ranked by total causal outgoing edges shown. Complete 20-regulator matrix provided in repository table.</w:t>
+        <w:t>Note: Top 12 causal regulators ranked by total causal outgoing edges shown. Full causal edge network provided in Supplementary Data 3.</w:t>
       </w:r>
     </w:p>
     <w:p>

</xml_diff>